<commit_message>
docs: passo a passo com estrutura de pastas e arquivo->pasta no doc de entrega
Secao 5 enriquecida: arvore de pastas (5.1), tabela arquivo->pasta->colunas
esperadas (5.2) e passo a passo numerado de 6 etapas (5.3).

Co-Authored-By: Claude Opus 4.8 <noreply@anthropic.com>
</commit_message>
<xml_diff>
--- a/ENTREGA/CVC_IAM_Analytics_Entrega_SYSTUR_v1.0.docx
+++ b/ENTREGA/CVC_IAM_Analytics_Entrega_SYSTUR_v1.0.docx
@@ -1216,7 +1216,7 @@
           <w:color w:val="16A085"/>
           <w:sz w:val="26"/>
         </w:rPr>
-        <w:t>5.1. Preparar a rede (uma vez)</w:t>
+        <w:t>5.1. Estrutura de pastas</w:t>
       </w:r>
     </w:p>
     <w:p>
@@ -1225,7 +1225,230 @@
           <w:i w:val="0"/>
           <w:sz w:val="21"/>
         </w:rPr>
-        <w:t>Extrair o pacote e copiar a pasta CVC_IAM_ANALYTICS para a raiz de rede (ex.: Z:\CVC\). O banco nasce vazio — será gerado no primeiro processamento.</w:t>
+        <w:t>Ao extrair o pacote, esta é a estrutura. As pastas em destaque são as que você usa no dia a dia (ENTRADA para depositar, DADOS para os resultados):</w:t>
+      </w:r>
+    </w:p>
+    <w:p>
+      <w:pPr>
+        <w:spacing w:after="120" w:before="80"/>
+        <w:shd w:val="clear" w:fill="EAF1F4"/>
+      </w:pPr>
+      <w:r>
+        <w:rPr>
+          <w:rFonts w:ascii="Consolas" w:hAnsi="Consolas"/>
+          <w:color w:val="1F2D5C"/>
+          <w:sz w:val="17"/>
+        </w:rPr>
+        <w:t>CVC_IAM_ANALYTICS/</w:t>
+      </w:r>
+      <w:r>
+        <w:br/>
+      </w:r>
+      <w:r>
+        <w:rPr>
+          <w:rFonts w:ascii="Consolas" w:hAnsi="Consolas"/>
+          <w:color w:val="1F2D5C"/>
+          <w:sz w:val="17"/>
+        </w:rPr>
+        <w:t>├── ENTRADA/                      &lt;- você COLOCA os arquivos aqui</w:t>
+      </w:r>
+      <w:r>
+        <w:br/>
+      </w:r>
+      <w:r>
+        <w:rPr>
+          <w:rFonts w:ascii="Consolas" w:hAnsi="Consolas"/>
+          <w:color w:val="1F2D5C"/>
+          <w:sz w:val="17"/>
+        </w:rPr>
+        <w:t>│   ├── RH/</w:t>
+      </w:r>
+      <w:r>
+        <w:br/>
+      </w:r>
+      <w:r>
+        <w:rPr>
+          <w:rFonts w:ascii="Consolas" w:hAnsi="Consolas"/>
+          <w:color w:val="1F2D5C"/>
+          <w:sz w:val="17"/>
+        </w:rPr>
+        <w:t>│   │   ├── ATIVOS/               &lt;- base de RH (funcionários ativos)</w:t>
+      </w:r>
+      <w:r>
+        <w:br/>
+      </w:r>
+      <w:r>
+        <w:rPr>
+          <w:rFonts w:ascii="Consolas" w:hAnsi="Consolas"/>
+          <w:color w:val="1F2D5C"/>
+          <w:sz w:val="17"/>
+        </w:rPr>
+        <w:t>│   │   └── DESLIGADOS/           (próxima fase)</w:t>
+      </w:r>
+      <w:r>
+        <w:br/>
+      </w:r>
+      <w:r>
+        <w:rPr>
+          <w:rFonts w:ascii="Consolas" w:hAnsi="Consolas"/>
+          <w:color w:val="1F2D5C"/>
+          <w:sz w:val="17"/>
+        </w:rPr>
+        <w:t>│   ├── MATRIZES/</w:t>
+      </w:r>
+      <w:r>
+        <w:br/>
+      </w:r>
+      <w:r>
+        <w:rPr>
+          <w:rFonts w:ascii="Consolas" w:hAnsi="Consolas"/>
+          <w:color w:val="1F2D5C"/>
+          <w:sz w:val="17"/>
+        </w:rPr>
+        <w:t>│   │   ├── ORGANIZACIONAL/       &lt;- Mapeamento CCO/CSC</w:t>
+      </w:r>
+      <w:r>
+        <w:br/>
+      </w:r>
+      <w:r>
+        <w:rPr>
+          <w:rFonts w:ascii="Consolas" w:hAnsi="Consolas"/>
+          <w:color w:val="1F2D5C"/>
+          <w:sz w:val="17"/>
+        </w:rPr>
+        <w:t>│   │   └── PERFIS_SISTEMAS/      &lt;- matriz de perfil por cargo (SYSTUR)</w:t>
+      </w:r>
+      <w:r>
+        <w:br/>
+      </w:r>
+      <w:r>
+        <w:rPr>
+          <w:rFonts w:ascii="Consolas" w:hAnsi="Consolas"/>
+          <w:color w:val="1F2D5C"/>
+          <w:sz w:val="17"/>
+        </w:rPr>
+        <w:t>│   └── SISTEMAS/</w:t>
+      </w:r>
+      <w:r>
+        <w:br/>
+      </w:r>
+      <w:r>
+        <w:rPr>
+          <w:rFonts w:ascii="Consolas" w:hAnsi="Consolas"/>
+          <w:color w:val="1F2D5C"/>
+          <w:sz w:val="17"/>
+        </w:rPr>
+        <w:t>│       ├── SYSTUR/               &lt;- extrato de acessos do SYSTUR</w:t>
+      </w:r>
+      <w:r>
+        <w:br/>
+      </w:r>
+      <w:r>
+        <w:rPr>
+          <w:rFonts w:ascii="Consolas" w:hAnsi="Consolas"/>
+          <w:color w:val="1F2D5C"/>
+          <w:sz w:val="17"/>
+        </w:rPr>
+        <w:t>│       ├── IC/ SIGOT/ SICA_RA/ ...   (próximas fases)</w:t>
+      </w:r>
+      <w:r>
+        <w:br/>
+      </w:r>
+      <w:r>
+        <w:rPr>
+          <w:rFonts w:ascii="Consolas" w:hAnsi="Consolas"/>
+          <w:color w:val="1F2D5C"/>
+          <w:sz w:val="17"/>
+        </w:rPr>
+        <w:t>├── DADOS/                        &lt;- o sistema GERA os resultados aqui</w:t>
+      </w:r>
+      <w:r>
+        <w:br/>
+      </w:r>
+      <w:r>
+        <w:rPr>
+          <w:rFonts w:ascii="Consolas" w:hAnsi="Consolas"/>
+          <w:color w:val="1F2D5C"/>
+          <w:sz w:val="17"/>
+        </w:rPr>
+        <w:t>│   ├── BANCO/                    -&gt; iam_analytics.db (gerado)</w:t>
+      </w:r>
+      <w:r>
+        <w:br/>
+      </w:r>
+      <w:r>
+        <w:rPr>
+          <w:rFonts w:ascii="Consolas" w:hAnsi="Consolas"/>
+          <w:color w:val="1F2D5C"/>
+          <w:sz w:val="17"/>
+        </w:rPr>
+        <w:t>│   ├── PROCESSADOS/              -&gt; arquivos já importados</w:t>
+      </w:r>
+      <w:r>
+        <w:br/>
+      </w:r>
+      <w:r>
+        <w:rPr>
+          <w:rFonts w:ascii="Consolas" w:hAnsi="Consolas"/>
+          <w:color w:val="1F2D5C"/>
+          <w:sz w:val="17"/>
+        </w:rPr>
+        <w:t>│   ├── ERROS/                    -&gt; arquivos rejeitados</w:t>
+      </w:r>
+      <w:r>
+        <w:br/>
+      </w:r>
+      <w:r>
+        <w:rPr>
+          <w:rFonts w:ascii="Consolas" w:hAnsi="Consolas"/>
+          <w:color w:val="1F2D5C"/>
+          <w:sz w:val="17"/>
+        </w:rPr>
+        <w:t>│   ├── SAIDAS/                   -&gt; relatórios</w:t>
+      </w:r>
+      <w:r>
+        <w:br/>
+      </w:r>
+      <w:r>
+        <w:rPr>
+          <w:rFonts w:ascii="Consolas" w:hAnsi="Consolas"/>
+          <w:color w:val="1F2D5C"/>
+          <w:sz w:val="17"/>
+        </w:rPr>
+        <w:t>│   └── LOGS/                     -&gt; logs de cada execução</w:t>
+      </w:r>
+      <w:r>
+        <w:br/>
+      </w:r>
+      <w:r>
+        <w:rPr>
+          <w:rFonts w:ascii="Consolas" w:hAnsi="Consolas"/>
+          <w:color w:val="1F2D5C"/>
+          <w:sz w:val="17"/>
+        </w:rPr>
+        <w:t>├── EXECUTAVEIS/                  &lt;- Processador.exe, visualizador.exe,</w:t>
+      </w:r>
+      <w:r>
+        <w:br/>
+      </w:r>
+      <w:r>
+        <w:rPr>
+          <w:rFonts w:ascii="Consolas" w:hAnsi="Consolas"/>
+          <w:color w:val="1F2D5C"/>
+          <w:sz w:val="17"/>
+        </w:rPr>
+        <w:t>│                                    CONFIG/, REPORT/, launcher/</w:t>
+      </w:r>
+      <w:r>
+        <w:br/>
+      </w:r>
+      <w:r>
+        <w:rPr>
+          <w:rFonts w:ascii="Consolas" w:hAnsi="Consolas"/>
+          <w:color w:val="1F2D5C"/>
+          <w:sz w:val="17"/>
+        </w:rPr>
+        <w:t>└── INTERACOES/                   &lt;- ações dos usuários (automático)</w:t>
       </w:r>
     </w:p>
     <w:p>
@@ -1237,7 +1460,7 @@
           <w:color w:val="16A085"/>
           <w:sz w:val="26"/>
         </w:rPr>
-        <w:t>5.2. Depositar os arquivos</w:t>
+        <w:t>5.2. Onde colocar cada arquivo</w:t>
       </w:r>
     </w:p>
     <w:p>
@@ -1246,7 +1469,331 @@
           <w:i w:val="0"/>
           <w:sz w:val="21"/>
         </w:rPr>
-        <w:t>Colocar os arquivos atuais nas pastas de ENTRADA conforme a tabela do item 2.1.</w:t>
+        <w:t>Para a Fase 1 (SYSTUR) são quatro arquivos. Cada um vai na sua pasta. Os importadores aceitam .xlsx e .csv. As colunas esperadas são configuráveis em EXECUTAVEIS/CONFIG/config.xml:</w:t>
+      </w:r>
+    </w:p>
+    <w:tbl>
+      <w:tblPr>
+        <w:tblStyle w:val="TableGrid"/>
+        <w:tblW w:type="auto" w:w="0"/>
+        <w:jc w:val="center"/>
+        <w:tblLook w:firstColumn="1" w:firstRow="1" w:lastColumn="0" w:lastRow="0" w:noHBand="0" w:noVBand="1" w:val="04A0"/>
+      </w:tblPr>
+      <w:tblGrid>
+        <w:gridCol w:w="3216"/>
+        <w:gridCol w:w="3216"/>
+        <w:gridCol w:w="3216"/>
+      </w:tblGrid>
+      <w:tr>
+        <w:tc>
+          <w:tcPr>
+            <w:tcW w:type="dxa" w:w="3024"/>
+            <w:shd w:val="clear" w:fill="1F2D5C"/>
+          </w:tcPr>
+          <w:p>
+            <w:pPr>
+              <w:spacing w:after="40" w:before="40"/>
+            </w:pPr>
+            <w:r/>
+            <w:r>
+              <w:rPr>
+                <w:b/>
+                <w:color w:val="FFFFFF"/>
+                <w:sz w:val="20"/>
+              </w:rPr>
+              <w:t>Arquivo (exemplo)</w:t>
+            </w:r>
+          </w:p>
+        </w:tc>
+        <w:tc>
+          <w:tcPr>
+            <w:tcW w:type="dxa" w:w="2880"/>
+            <w:shd w:val="clear" w:fill="1F2D5C"/>
+          </w:tcPr>
+          <w:p>
+            <w:pPr>
+              <w:spacing w:after="40" w:before="40"/>
+            </w:pPr>
+            <w:r/>
+            <w:r>
+              <w:rPr>
+                <w:b/>
+                <w:color w:val="FFFFFF"/>
+                <w:sz w:val="20"/>
+              </w:rPr>
+              <w:t>Pasta de destino</w:t>
+            </w:r>
+          </w:p>
+        </w:tc>
+        <w:tc>
+          <w:tcPr>
+            <w:tcW w:type="dxa" w:w="4320"/>
+            <w:shd w:val="clear" w:fill="1F2D5C"/>
+          </w:tcPr>
+          <w:p>
+            <w:pPr>
+              <w:spacing w:after="40" w:before="40"/>
+            </w:pPr>
+            <w:r/>
+            <w:r>
+              <w:rPr>
+                <w:b/>
+                <w:color w:val="FFFFFF"/>
+                <w:sz w:val="20"/>
+              </w:rPr>
+              <w:t>Colunas esperadas</w:t>
+            </w:r>
+          </w:p>
+        </w:tc>
+      </w:tr>
+      <w:tr>
+        <w:tc>
+          <w:tcPr>
+            <w:tcW w:type="dxa" w:w="3024"/>
+          </w:tcPr>
+          <w:p>
+            <w:pPr>
+              <w:spacing w:after="40" w:before="40"/>
+            </w:pPr>
+            <w:r/>
+            <w:r>
+              <w:rPr>
+                <w:b w:val="0"/>
+                <w:sz w:val="20"/>
+              </w:rPr>
+              <w:t>Base de RH ativos</w:t>
+              <w:br/>
+              <w:t>(ex.: PROJETOIAM.csv)</w:t>
+            </w:r>
+          </w:p>
+        </w:tc>
+        <w:tc>
+          <w:tcPr>
+            <w:tcW w:type="dxa" w:w="2880"/>
+          </w:tcPr>
+          <w:p>
+            <w:pPr>
+              <w:spacing w:after="40" w:before="40"/>
+            </w:pPr>
+            <w:r/>
+            <w:r>
+              <w:rPr>
+                <w:b w:val="0"/>
+                <w:sz w:val="20"/>
+              </w:rPr>
+              <w:t>ENTRADA/RH/ATIVOS</w:t>
+            </w:r>
+          </w:p>
+        </w:tc>
+        <w:tc>
+          <w:tcPr>
+            <w:tcW w:type="dxa" w:w="4320"/>
+          </w:tcPr>
+          <w:p>
+            <w:pPr>
+              <w:spacing w:after="40" w:before="40"/>
+            </w:pPr>
+            <w:r/>
+            <w:r>
+              <w:rPr>
+                <w:b w:val="0"/>
+                <w:sz w:val="20"/>
+              </w:rPr>
+              <w:t>MATRICULA, NOME, CPF, CARGO_CODIGO, CARGO_DESCRICAO, DEPARTAMENTO, CENTRO_CUSTO, DATA_ADMISSAO, EMAIL, SITUACAO</w:t>
+            </w:r>
+          </w:p>
+        </w:tc>
+      </w:tr>
+      <w:tr>
+        <w:tc>
+          <w:tcPr>
+            <w:tcW w:type="dxa" w:w="3024"/>
+            <w:shd w:val="clear" w:fill="EAF1F4"/>
+          </w:tcPr>
+          <w:p>
+            <w:pPr>
+              <w:spacing w:after="40" w:before="40"/>
+            </w:pPr>
+            <w:r/>
+            <w:r>
+              <w:rPr>
+                <w:b w:val="0"/>
+                <w:sz w:val="20"/>
+              </w:rPr>
+              <w:t>Mapeamento CCO/CSC</w:t>
+              <w:br/>
+              <w:t>(ex.: Mapeamento CCO_CSC.xlsx)</w:t>
+            </w:r>
+          </w:p>
+        </w:tc>
+        <w:tc>
+          <w:tcPr>
+            <w:tcW w:type="dxa" w:w="2880"/>
+            <w:shd w:val="clear" w:fill="EAF1F4"/>
+          </w:tcPr>
+          <w:p>
+            <w:pPr>
+              <w:spacing w:after="40" w:before="40"/>
+            </w:pPr>
+            <w:r/>
+            <w:r>
+              <w:rPr>
+                <w:b w:val="0"/>
+                <w:sz w:val="20"/>
+              </w:rPr>
+              <w:t>ENTRADA/MATRIZES/ORGANIZACIONAL</w:t>
+            </w:r>
+          </w:p>
+        </w:tc>
+        <w:tc>
+          <w:tcPr>
+            <w:tcW w:type="dxa" w:w="4320"/>
+            <w:shd w:val="clear" w:fill="EAF1F4"/>
+          </w:tcPr>
+          <w:p>
+            <w:pPr>
+              <w:spacing w:after="40" w:before="40"/>
+            </w:pPr>
+            <w:r/>
+            <w:r>
+              <w:rPr>
+                <w:b w:val="0"/>
+                <w:sz w:val="20"/>
+              </w:rPr>
+              <w:t>CARGO_CODIGO, CARGO_DESCRICAO, DEPARTAMENTO, CENTRO_CUSTO</w:t>
+            </w:r>
+          </w:p>
+        </w:tc>
+      </w:tr>
+      <w:tr>
+        <w:tc>
+          <w:tcPr>
+            <w:tcW w:type="dxa" w:w="3024"/>
+          </w:tcPr>
+          <w:p>
+            <w:pPr>
+              <w:spacing w:after="40" w:before="40"/>
+            </w:pPr>
+            <w:r/>
+            <w:r>
+              <w:rPr>
+                <w:b w:val="0"/>
+                <w:sz w:val="20"/>
+              </w:rPr>
+              <w:t>Matriz de perfil SYSTUR</w:t>
+              <w:br/>
+              <w:t>(ex.: MATRIZ DE PERFIL ... SYSTUR.xlsx)</w:t>
+            </w:r>
+          </w:p>
+        </w:tc>
+        <w:tc>
+          <w:tcPr>
+            <w:tcW w:type="dxa" w:w="2880"/>
+          </w:tcPr>
+          <w:p>
+            <w:pPr>
+              <w:spacing w:after="40" w:before="40"/>
+            </w:pPr>
+            <w:r/>
+            <w:r>
+              <w:rPr>
+                <w:b w:val="0"/>
+                <w:sz w:val="20"/>
+              </w:rPr>
+              <w:t>ENTRADA/MATRIZES/PERFIS_SISTEMAS</w:t>
+            </w:r>
+          </w:p>
+        </w:tc>
+        <w:tc>
+          <w:tcPr>
+            <w:tcW w:type="dxa" w:w="4320"/>
+          </w:tcPr>
+          <w:p>
+            <w:pPr>
+              <w:spacing w:after="40" w:before="40"/>
+            </w:pPr>
+            <w:r/>
+            <w:r>
+              <w:rPr>
+                <w:b w:val="0"/>
+                <w:sz w:val="20"/>
+              </w:rPr>
+              <w:t>CARGO_CODIGO, SISTEMA, PERFIL</w:t>
+            </w:r>
+          </w:p>
+        </w:tc>
+      </w:tr>
+      <w:tr>
+        <w:tc>
+          <w:tcPr>
+            <w:tcW w:type="dxa" w:w="3024"/>
+            <w:shd w:val="clear" w:fill="EAF1F4"/>
+          </w:tcPr>
+          <w:p>
+            <w:pPr>
+              <w:spacing w:after="40" w:before="40"/>
+            </w:pPr>
+            <w:r/>
+            <w:r>
+              <w:rPr>
+                <w:b w:val="0"/>
+                <w:sz w:val="20"/>
+              </w:rPr>
+              <w:t>Extrato de acessos SYSTUR</w:t>
+              <w:br/>
+              <w:t>(ex.: relatorio systur.xlsx)</w:t>
+            </w:r>
+          </w:p>
+        </w:tc>
+        <w:tc>
+          <w:tcPr>
+            <w:tcW w:type="dxa" w:w="2880"/>
+            <w:shd w:val="clear" w:fill="EAF1F4"/>
+          </w:tcPr>
+          <w:p>
+            <w:pPr>
+              <w:spacing w:after="40" w:before="40"/>
+            </w:pPr>
+            <w:r/>
+            <w:r>
+              <w:rPr>
+                <w:b w:val="0"/>
+                <w:sz w:val="20"/>
+              </w:rPr>
+              <w:t>ENTRADA/SISTEMAS/SYSTUR</w:t>
+            </w:r>
+          </w:p>
+        </w:tc>
+        <w:tc>
+          <w:tcPr>
+            <w:tcW w:type="dxa" w:w="4320"/>
+            <w:shd w:val="clear" w:fill="EAF1F4"/>
+          </w:tcPr>
+          <w:p>
+            <w:pPr>
+              <w:spacing w:after="40" w:before="40"/>
+            </w:pPr>
+            <w:r/>
+            <w:r>
+              <w:rPr>
+                <w:b w:val="0"/>
+                <w:sz w:val="20"/>
+              </w:rPr>
+              <w:t>USUARIO, NOME, PERFIL, SITUACAO, DATA_CRIACAO, ULTIMO_ACESSO</w:t>
+            </w:r>
+          </w:p>
+        </w:tc>
+      </w:tr>
+    </w:tbl>
+    <w:p/>
+    <w:p>
+      <w:r>
+        <w:rPr>
+          <w:i/>
+          <w:color w:val="5A6377"/>
+          <w:sz w:val="21"/>
+        </w:rPr>
+        <w:t>Dica: pode colocar mais de um arquivo na mesma pasta — o Processador lê todos. Após importar, cada arquivo é movido para uma subpasta PROCESSADOS dentro da própria pasta de origem.</w:t>
       </w:r>
     </w:p>
     <w:p>
@@ -1258,37 +1805,103 @@
           <w:color w:val="16A085"/>
           <w:sz w:val="26"/>
         </w:rPr>
-        <w:t>5.3. Primeiro processamento</w:t>
+        <w:t>5.3. Passo a passo</w:t>
       </w:r>
     </w:p>
     <w:p>
       <w:r>
         <w:rPr>
-          <w:i w:val="0"/>
+          <w:b/>
+          <w:color w:val="1F2D5C"/>
           <w:sz w:val="21"/>
         </w:rPr>
-        <w:t>Rodar o Processador.exe uma vez. Ao final: o banco iam_analytics.db é criado, os arquivos lidos vão para PROCESSADOS e o log fica em DADOS/LOGS.</w:t>
+        <w:t xml:space="preserve">Passo 1 — Preparar a rede (uma vez). </w:t>
       </w:r>
-    </w:p>
-    <w:p>
-      <w:pPr>
-        <w:pStyle w:val="Heading2"/>
-      </w:pPr>
       <w:r>
         <w:rPr>
-          <w:color w:val="16A085"/>
-          <w:sz w:val="26"/>
+          <w:sz w:val="21"/>
         </w:rPr>
-        <w:t>5.4. Abrir o painel</w:t>
+        <w:t>Extrair o pacote e copiar a pasta CVC_IAM_ANALYTICS para a raiz de rede (ex.: Z:\CVC\). O banco nasce vazio.</w:t>
       </w:r>
     </w:p>
     <w:p>
       <w:r>
         <w:rPr>
-          <w:i w:val="0"/>
+          <w:b/>
+          <w:color w:val="1F2D5C"/>
           <w:sz w:val="21"/>
         </w:rPr>
-        <w:t>Cada usuário copia a pasta EXECUTAVEIS para a sua máquina e roda o visualizador.exe. O painel abre no navegador (http://127.0.0.1:8800/). Atualizações na base aparecem ao reabrir/atualizar — mudanças no painel não exigem reprocessar.</w:t>
+        <w:t xml:space="preserve">Passo 2 — Depositar os arquivos. </w:t>
+      </w:r>
+      <w:r>
+        <w:rPr>
+          <w:sz w:val="21"/>
+        </w:rPr>
+        <w:t>Colocar os quatro arquivos nas pastas de ENTRADA conforme a tabela 5.2.</w:t>
+      </w:r>
+    </w:p>
+    <w:p>
+      <w:r>
+        <w:rPr>
+          <w:b/>
+          <w:color w:val="1F2D5C"/>
+          <w:sz w:val="21"/>
+        </w:rPr>
+        <w:t xml:space="preserve">Passo 3 — Rodar o Processador. </w:t>
+      </w:r>
+      <w:r>
+        <w:rPr>
+          <w:sz w:val="21"/>
+        </w:rPr>
+        <w:t>Executar EXECUTAVEIS\Processador.exe uma vez. Ao final: o banco iam_analytics.db é criado em DADOS/BANCO, os arquivos lidos vão para PROCESSADOS e o log fica em DADOS/LOGS. Arquivos com problema vão para ERROS.</w:t>
+      </w:r>
+    </w:p>
+    <w:p>
+      <w:r>
+        <w:rPr>
+          <w:b/>
+          <w:color w:val="1F2D5C"/>
+          <w:sz w:val="21"/>
+        </w:rPr>
+        <w:t xml:space="preserve">Passo 4 — Instalar o Visualizador em cada máquina. </w:t>
+      </w:r>
+      <w:r>
+        <w:rPr>
+          <w:sz w:val="21"/>
+        </w:rPr>
+        <w:t>Copiar a pasta EXECUTAVEIS para a máquina do usuário (ex.: C:\CVC\) e rodar o visualizador.exe de lá. Ele se auto-atualiza a partir da rede.</w:t>
+      </w:r>
+    </w:p>
+    <w:p>
+      <w:r>
+        <w:rPr>
+          <w:b/>
+          <w:color w:val="1F2D5C"/>
+          <w:sz w:val="21"/>
+        </w:rPr>
+        <w:t xml:space="preserve">Passo 5 — Abrir o painel. </w:t>
+      </w:r>
+      <w:r>
+        <w:rPr>
+          <w:sz w:val="21"/>
+        </w:rPr>
+        <w:t>O visualizador.exe abre o painel no navegador (http://127.0.0.1:8800/). Acompanhar e tratar as pendências pelas seis abas.</w:t>
+      </w:r>
+    </w:p>
+    <w:p>
+      <w:r>
+        <w:rPr>
+          <w:b/>
+          <w:color w:val="1F2D5C"/>
+          <w:sz w:val="21"/>
+        </w:rPr>
+        <w:t xml:space="preserve">Passo 6 — Atualizar o cenário. </w:t>
+      </w:r>
+      <w:r>
+        <w:rPr>
+          <w:sz w:val="21"/>
+        </w:rPr>
+        <w:t>Sempre que houver bases novas, repetir os passos 2 e 3 (depositar + Processador). Mudanças só no painel NÃO exigem reprocessar — basta reabrir/atualizar o Visualizador.</w:t>
       </w:r>
     </w:p>
     <w:p>

</xml_diff>

<commit_message>
docs: detalha secao 3 (Processador e Painel) — menos vaga, por etapas
Co-Authored-By: Claude Opus 4.8 <noreply@anthropic.com>
</commit_message>
<xml_diff>
--- a/ENTREGA/CVC_IAM_Analytics_Entrega_SYSTUR_v1.0.docx
+++ b/ENTREGA/CVC_IAM_Analytics_Entrega_SYSTUR_v1.0.docx
@@ -832,200 +832,167 @@
           <w:i w:val="0"/>
           <w:sz w:val="21"/>
         </w:rPr>
-        <w:t>A solução tem dois programas, com papéis bem definidos:</w:t>
+        <w:t>A solução tem dois programas que trabalham juntos: um prepara os resultados e o outro os apresenta.</w:t>
       </w:r>
     </w:p>
-    <w:tbl>
-      <w:tblPr>
-        <w:tblStyle w:val="TableGrid"/>
-        <w:tblW w:type="auto" w:w="0"/>
-        <w:jc w:val="center"/>
-        <w:tblLook w:firstColumn="1" w:firstRow="1" w:lastColumn="0" w:lastRow="0" w:noHBand="0" w:noVBand="1" w:val="04A0"/>
-      </w:tblPr>
-      <w:tblGrid>
-        <w:gridCol w:w="3216"/>
-        <w:gridCol w:w="3216"/>
-        <w:gridCol w:w="3216"/>
-      </w:tblGrid>
-      <w:tr>
-        <w:tc>
-          <w:tcPr>
-            <w:tcW w:type="dxa" w:w="2160"/>
-            <w:shd w:val="clear" w:fill="1F2D5C"/>
-          </w:tcPr>
-          <w:p>
-            <w:pPr>
-              <w:spacing w:after="40" w:before="40"/>
-            </w:pPr>
-            <w:r/>
-            <w:r>
-              <w:rPr>
-                <w:b/>
-                <w:color w:val="FFFFFF"/>
-                <w:sz w:val="20"/>
-              </w:rPr>
-              <w:t>Programa</w:t>
-            </w:r>
-          </w:p>
-        </w:tc>
-        <w:tc>
-          <w:tcPr>
-            <w:tcW w:type="dxa" w:w="5760"/>
-            <w:shd w:val="clear" w:fill="1F2D5C"/>
-          </w:tcPr>
-          <w:p>
-            <w:pPr>
-              <w:spacing w:after="40" w:before="40"/>
-            </w:pPr>
-            <w:r/>
-            <w:r>
-              <w:rPr>
-                <w:b/>
-                <w:color w:val="FFFFFF"/>
-                <w:sz w:val="20"/>
-              </w:rPr>
-              <w:t>Para que serve</w:t>
-            </w:r>
-          </w:p>
-        </w:tc>
-        <w:tc>
-          <w:tcPr>
-            <w:tcW w:type="dxa" w:w="2448"/>
-            <w:shd w:val="clear" w:fill="1F2D5C"/>
-          </w:tcPr>
-          <w:p>
-            <w:pPr>
-              <w:spacing w:after="40" w:before="40"/>
-            </w:pPr>
-            <w:r/>
-            <w:r>
-              <w:rPr>
-                <w:b/>
-                <w:color w:val="FFFFFF"/>
-                <w:sz w:val="20"/>
-              </w:rPr>
-              <w:t>Quem usa</w:t>
-            </w:r>
-          </w:p>
-        </w:tc>
-      </w:tr>
-      <w:tr>
-        <w:tc>
-          <w:tcPr>
-            <w:tcW w:type="dxa" w:w="2160"/>
-          </w:tcPr>
-          <w:p>
-            <w:pPr>
-              <w:spacing w:after="40" w:before="40"/>
-            </w:pPr>
-            <w:r/>
-            <w:r>
-              <w:rPr>
-                <w:b w:val="0"/>
-                <w:sz w:val="20"/>
-              </w:rPr>
-              <w:t>O Processador</w:t>
-            </w:r>
-          </w:p>
-        </w:tc>
-        <w:tc>
-          <w:tcPr>
-            <w:tcW w:type="dxa" w:w="5760"/>
-          </w:tcPr>
-          <w:p>
-            <w:pPr>
-              <w:spacing w:after="40" w:before="40"/>
-            </w:pPr>
-            <w:r/>
-            <w:r>
-              <w:rPr>
-                <w:b w:val="0"/>
-                <w:sz w:val="20"/>
-              </w:rPr>
-              <w:t>Lê os arquivos, faz a comparação e prepara os resultados. É usado quando há bases novas para analisar.</w:t>
-            </w:r>
-          </w:p>
-        </w:tc>
-        <w:tc>
-          <w:tcPr>
-            <w:tcW w:type="dxa" w:w="2448"/>
-          </w:tcPr>
-          <w:p>
-            <w:pPr>
-              <w:spacing w:after="40" w:before="40"/>
-            </w:pPr>
-            <w:r/>
-            <w:r>
-              <w:rPr>
-                <w:b w:val="0"/>
-                <w:sz w:val="20"/>
-              </w:rPr>
-              <w:t>A pessoa responsável pelo processamento</w:t>
-            </w:r>
-          </w:p>
-        </w:tc>
-      </w:tr>
-      <w:tr>
-        <w:tc>
-          <w:tcPr>
-            <w:tcW w:type="dxa" w:w="2160"/>
-            <w:shd w:val="clear" w:fill="EAF1F4"/>
-          </w:tcPr>
-          <w:p>
-            <w:pPr>
-              <w:spacing w:after="40" w:before="40"/>
-            </w:pPr>
-            <w:r/>
-            <w:r>
-              <w:rPr>
-                <w:b w:val="0"/>
-                <w:sz w:val="20"/>
-              </w:rPr>
-              <w:t>O Painel</w:t>
-            </w:r>
-          </w:p>
-        </w:tc>
-        <w:tc>
-          <w:tcPr>
-            <w:tcW w:type="dxa" w:w="5760"/>
-            <w:shd w:val="clear" w:fill="EAF1F4"/>
-          </w:tcPr>
-          <w:p>
-            <w:pPr>
-              <w:spacing w:after="40" w:before="40"/>
-            </w:pPr>
-            <w:r/>
-            <w:r>
-              <w:rPr>
-                <w:b w:val="0"/>
-                <w:sz w:val="20"/>
-              </w:rPr>
-              <w:t>Mostra os resultados na tela e é onde o time acompanha e trata as pendências, no dia a dia.</w:t>
-            </w:r>
-          </w:p>
-        </w:tc>
-        <w:tc>
-          <w:tcPr>
-            <w:tcW w:type="dxa" w:w="2448"/>
-            <w:shd w:val="clear" w:fill="EAF1F4"/>
-          </w:tcPr>
-          <w:p>
-            <w:pPr>
-              <w:spacing w:after="40" w:before="40"/>
-            </w:pPr>
-            <w:r/>
-            <w:r>
-              <w:rPr>
-                <w:b w:val="0"/>
-                <w:sz w:val="20"/>
-              </w:rPr>
-              <w:t>Todas as pessoas do time</w:t>
-            </w:r>
-          </w:p>
-        </w:tc>
-      </w:tr>
-    </w:tbl>
-    <w:p/>
+    <w:p>
+      <w:pPr>
+        <w:pStyle w:val="Heading2"/>
+      </w:pPr>
+      <w:r>
+        <w:rPr>
+          <w:color w:val="16A085"/>
+          <w:sz w:val="26"/>
+        </w:rPr>
+        <w:t>3.1. O Processador</w:t>
+      </w:r>
+    </w:p>
+    <w:p>
+      <w:r>
+        <w:rPr>
+          <w:i w:val="0"/>
+          <w:sz w:val="21"/>
+        </w:rPr>
+        <w:t>É o motor da análise. Ele faz, de ponta a ponta:</w:t>
+      </w:r>
+    </w:p>
+    <w:p>
+      <w:pPr>
+        <w:pStyle w:val="ListBullet"/>
+      </w:pPr>
+      <w:r>
+        <w:rPr>
+          <w:sz w:val="21"/>
+        </w:rPr>
+        <w:t>lê os arquivos colocados na pasta de entrada (RH, matriz e extrato);</w:t>
+      </w:r>
+    </w:p>
+    <w:p>
+      <w:pPr>
+        <w:pStyle w:val="ListBullet"/>
+      </w:pPr>
+      <w:r>
+        <w:rPr>
+          <w:sz w:val="21"/>
+        </w:rPr>
+        <w:t>padroniza as informações (acerta maiúsculas, acentos, espaços, códigos) para comparar corretamente;</w:t>
+      </w:r>
+    </w:p>
+    <w:p>
+      <w:pPr>
+        <w:pStyle w:val="ListBullet"/>
+      </w:pPr>
+      <w:r>
+        <w:rPr>
+          <w:sz w:val="21"/>
+        </w:rPr>
+        <w:t>cruza o que cada pessoa acessa com o que o cargo prevê e gera a classificação (Aderente, Incluir, Alterar, Em Análise, Não Mapeado);</w:t>
+      </w:r>
+    </w:p>
+    <w:p>
+      <w:pPr>
+        <w:pStyle w:val="ListBullet"/>
+      </w:pPr>
+      <w:r>
+        <w:rPr>
+          <w:sz w:val="21"/>
+        </w:rPr>
+        <w:t>grava o resultado na base de dados compartilhada — é essa base que o Painel lê;</w:t>
+      </w:r>
+    </w:p>
+    <w:p>
+      <w:pPr>
+        <w:pStyle w:val="ListBullet"/>
+      </w:pPr>
+      <w:r>
+        <w:rPr>
+          <w:sz w:val="21"/>
+        </w:rPr>
+        <w:t>arquiva os arquivos já usados e registra um log de cada execução (e separa os que tiveram problema).</w:t>
+      </w:r>
+    </w:p>
+    <w:p>
+      <w:r>
+        <w:rPr>
+          <w:i w:val="0"/>
+          <w:sz w:val="21"/>
+        </w:rPr>
+        <w:t>Quando usar: sob demanda, sempre que chegarem bases novas. Quem usa: a pessoa responsável pelo processamento. Não precisa ficar aberto — roda, conclui e fecha.</w:t>
+      </w:r>
+    </w:p>
+    <w:p>
+      <w:pPr>
+        <w:pStyle w:val="Heading2"/>
+      </w:pPr>
+      <w:r>
+        <w:rPr>
+          <w:color w:val="16A085"/>
+          <w:sz w:val="26"/>
+        </w:rPr>
+        <w:t>3.2. O Painel</w:t>
+      </w:r>
+    </w:p>
+    <w:p>
+      <w:r>
+        <w:rPr>
+          <w:i w:val="0"/>
+          <w:sz w:val="21"/>
+        </w:rPr>
+        <w:t>É a tela de trabalho do dia a dia. Ele lê a base gerada pelo Processador e apresenta tudo de forma visual, no navegador, organizado em seis telas (detalhadas no item 6). No Painel o time:</w:t>
+      </w:r>
+    </w:p>
+    <w:p>
+      <w:pPr>
+        <w:pStyle w:val="ListBullet"/>
+      </w:pPr>
+      <w:r>
+        <w:rPr>
+          <w:sz w:val="21"/>
+        </w:rPr>
+        <w:t>consulta a situação de acesso de qualquer pessoa;</w:t>
+      </w:r>
+    </w:p>
+    <w:p>
+      <w:pPr>
+        <w:pStyle w:val="ListBullet"/>
+      </w:pPr>
+      <w:r>
+        <w:rPr>
+          <w:sz w:val="21"/>
+        </w:rPr>
+        <w:t>acompanha os indicadores e a evolução dos atendimentos;</w:t>
+      </w:r>
+    </w:p>
+    <w:p>
+      <w:pPr>
+        <w:pStyle w:val="ListBullet"/>
+      </w:pPr>
+      <w:r>
+        <w:rPr>
+          <w:sz w:val="21"/>
+        </w:rPr>
+        <w:t>trata as pendências: resolve (sob um chamado), coloca em quarentena e exporta para Excel.</w:t>
+      </w:r>
+    </w:p>
+    <w:p>
+      <w:r>
+        <w:rPr>
+          <w:i w:val="0"/>
+          <w:sz w:val="21"/>
+        </w:rPr>
+        <w:t>Quem usa: todo o time. Várias pessoas podem abrir ao mesmo tempo, cada uma no seu computador, vendo o mesmo cenário. Diferente do Processador, ele fica aberto enquanto a pessoa trabalha.</w:t>
+      </w:r>
+    </w:p>
+    <w:p>
+      <w:r>
+        <w:rPr>
+          <w:i/>
+          <w:color w:val="1F2D5C"/>
+          <w:sz w:val="21"/>
+        </w:rPr>
+        <w:t>Em resumo: o Processador gera os dados; o Painel mostra e trata. Quem só acompanha precisa apenas do Painel.</w:t>
+      </w:r>
+    </w:p>
     <w:p>
       <w:pPr>
         <w:pStyle w:val="Heading1"/>

</xml_diff>

<commit_message>
docs: arvore de pastas com nomes reais (ENTRADA/DADOS/EXECUTAVEIS/INTERACOES)
Corrige achismo: 'RESULTADOS'/'PROGRAMAS' nao existem -> DADOS e EXECUTAVEIS;
detalha subpastas reais de DADOS (BANCO/SAIDAS/PROCESSADOS/ERROS/LOGS) e inclui
INTERACOES.

Co-Authored-By: Claude Opus 4.8 <noreply@anthropic.com>
</commit_message>
<xml_diff>
--- a/ENTREGA/CVC_IAM_Analytics_Entrega_SYSTUR_v1.0.docx
+++ b/ENTREGA/CVC_IAM_Analytics_Entrega_SYSTUR_v1.0.docx
@@ -1088,7 +1088,7 @@
           <w:i w:val="0"/>
           <w:sz w:val="21"/>
         </w:rPr>
-        <w:t>Ao receber a solução, esta é a organização das pastas. No dia a dia você usa principalmente duas: a de entrada (onde você coloca os arquivos) e a de resultados (preenchida pela ferramenta).</w:t>
+        <w:t>Ao receber a solução, esta é a organização das pastas. No dia a dia você usa principalmente duas: a ENTRADA (onde você coloca os arquivos) e a DADOS (preenchida pela ferramenta com os resultados).</w:t>
       </w:r>
     </w:p>
     <w:p>
@@ -1102,7 +1102,7 @@
           <w:color w:val="1F2D5C"/>
           <w:sz w:val="18"/>
         </w:rPr>
-        <w:t>CVC IAM Analytics</w:t>
+        <w:t>CVC_IAM_ANALYTICS</w:t>
       </w:r>
       <w:r>
         <w:br/>
@@ -1135,7 +1135,7 @@
           <w:color w:val="1F2D5C"/>
           <w:sz w:val="18"/>
         </w:rPr>
-        <w:t>│     ├── RH .............. base de funcionários</w:t>
+        <w:t>│     ├── RH ............. base de funcionários</w:t>
       </w:r>
       <w:r>
         <w:br/>
@@ -1146,7 +1146,7 @@
           <w:color w:val="1F2D5C"/>
           <w:sz w:val="18"/>
         </w:rPr>
-        <w:t>│     ├── MATRIZES ........ matriz de perfil e mapeamento</w:t>
+        <w:t>│     ├── MATRIZES ....... Matriz de Perfil de Acesso e Mapeamento CCO/CSC</w:t>
       </w:r>
       <w:r>
         <w:br/>
@@ -1157,7 +1157,7 @@
           <w:color w:val="1F2D5C"/>
           <w:sz w:val="18"/>
         </w:rPr>
-        <w:t>│     └── SISTEMAS ........ extrato de acesso (SYSTUR)</w:t>
+        <w:t>│     └── SISTEMAS ....... extrato de acesso (SYSTUR)</w:t>
       </w:r>
       <w:r>
         <w:br/>
@@ -1179,7 +1179,7 @@
           <w:color w:val="1F2D5C"/>
           <w:sz w:val="18"/>
         </w:rPr>
-        <w:t>├── RESULTADOS  ← a ferramenta preenche sozinha</w:t>
+        <w:t>├── DADOS  ← a ferramenta preenche sozinha</w:t>
       </w:r>
       <w:r>
         <w:br/>
@@ -1190,7 +1190,51 @@
           <w:color w:val="1F2D5C"/>
           <w:sz w:val="18"/>
         </w:rPr>
-        <w:t>│     (base de dados, relatórios, arquivos já usados, registros)</w:t>
+        <w:t>│     ├── BANCO ......... a base de dados gerada</w:t>
+      </w:r>
+      <w:r>
+        <w:br/>
+      </w:r>
+      <w:r>
+        <w:rPr>
+          <w:rFonts w:ascii="Consolas" w:hAnsi="Consolas"/>
+          <w:color w:val="1F2D5C"/>
+          <w:sz w:val="18"/>
+        </w:rPr>
+        <w:t>│     ├── SAIDAS ........ relatórios</w:t>
+      </w:r>
+      <w:r>
+        <w:br/>
+      </w:r>
+      <w:r>
+        <w:rPr>
+          <w:rFonts w:ascii="Consolas" w:hAnsi="Consolas"/>
+          <w:color w:val="1F2D5C"/>
+          <w:sz w:val="18"/>
+        </w:rPr>
+        <w:t>│     ├── PROCESSADOS ... arquivos já usados</w:t>
+      </w:r>
+      <w:r>
+        <w:br/>
+      </w:r>
+      <w:r>
+        <w:rPr>
+          <w:rFonts w:ascii="Consolas" w:hAnsi="Consolas"/>
+          <w:color w:val="1F2D5C"/>
+          <w:sz w:val="18"/>
+        </w:rPr>
+        <w:t>│     ├── ERROS ......... arquivos com problema</w:t>
+      </w:r>
+      <w:r>
+        <w:br/>
+      </w:r>
+      <w:r>
+        <w:rPr>
+          <w:rFonts w:ascii="Consolas" w:hAnsi="Consolas"/>
+          <w:color w:val="1F2D5C"/>
+          <w:sz w:val="18"/>
+        </w:rPr>
+        <w:t>│     └── LOGS .......... registros de cada execução</w:t>
       </w:r>
       <w:r>
         <w:br/>
@@ -1212,7 +1256,29 @@
           <w:color w:val="1F2D5C"/>
           <w:sz w:val="18"/>
         </w:rPr>
-        <w:t>└── PROGRAMAS  ← o Processador e o Painel</w:t>
+        <w:t>├── EXECUTAVEIS  ← os programas (Processador e Painel)</w:t>
+      </w:r>
+      <w:r>
+        <w:br/>
+      </w:r>
+      <w:r>
+        <w:rPr>
+          <w:rFonts w:ascii="Consolas" w:hAnsi="Consolas"/>
+          <w:color w:val="1F2D5C"/>
+          <w:sz w:val="18"/>
+        </w:rPr>
+        <w:t>│</w:t>
+      </w:r>
+      <w:r>
+        <w:br/>
+      </w:r>
+      <w:r>
+        <w:rPr>
+          <w:rFonts w:ascii="Consolas" w:hAnsi="Consolas"/>
+          <w:color w:val="1F2D5C"/>
+          <w:sz w:val="18"/>
+        </w:rPr>
+        <w:t>└── INTERACOES  ← ações dos usuários (preenchida automaticamente)</w:t>
       </w:r>
     </w:p>
     <w:p>
@@ -1222,7 +1288,7 @@
           <w:color w:val="5A6377"/>
           <w:sz w:val="21"/>
         </w:rPr>
-        <w:t>Observação: os nomes das subpastas que aparecem ao abrir a solução estão em letras maiúsculas (ENTRADA, RH, MATRIZES, SISTEMAS). É só seguir esses nomes ao guardar cada arquivo.</w:t>
+        <w:t>Observação: as pastas aparecem com os nomes em maiúsculas exatamente assim (ENTRADA, DADOS, EXECUTAVEIS, INTERACOES). É só seguir esses nomes ao guardar cada arquivo.</w:t>
       </w:r>
     </w:p>
     <w:p>

</xml_diff>

<commit_message>
docs: programa = Visualizador (nao 'Painel'); painel = a tela que ele abre
Co-Authored-By: Claude Opus 4.8 <noreply@anthropic.com>
</commit_message>
<xml_diff>
--- a/ENTREGA/CVC_IAM_Analytics_Entrega_SYSTUR_v1.0.docx
+++ b/ENTREGA/CVC_IAM_Analytics_Entrega_SYSTUR_v1.0.docx
@@ -897,7 +897,7 @@
         <w:rPr>
           <w:sz w:val="21"/>
         </w:rPr>
-        <w:t>grava o resultado na base de dados compartilhada — é essa base que o Painel lê;</w:t>
+        <w:t>grava o resultado na base de dados compartilhada — é essa base que o Visualizador lê;</w:t>
       </w:r>
     </w:p>
     <w:p>
@@ -929,7 +929,7 @@
           <w:color w:val="16A085"/>
           <w:sz w:val="26"/>
         </w:rPr>
-        <w:t>3.2. O Painel</w:t>
+        <w:t>3.2. O Visualizador (Painel)</w:t>
       </w:r>
     </w:p>
     <w:p>
@@ -938,7 +938,7 @@
           <w:i w:val="0"/>
           <w:sz w:val="21"/>
         </w:rPr>
-        <w:t>É a tela de trabalho do dia a dia. Ele lê a base gerada pelo Processador e apresenta tudo de forma visual, no navegador, organizado em seis telas (detalhadas no item 6). No Painel o time:</w:t>
+        <w:t>É o programa do dia a dia. O Visualizador lê a base gerada pelo Processador e abre o painel no navegador — a parte visual, organizada em seis telas (detalhadas no item 6). No painel, o time:</w:t>
       </w:r>
     </w:p>
     <w:p>
@@ -990,7 +990,7 @@
           <w:color w:val="1F2D5C"/>
           <w:sz w:val="21"/>
         </w:rPr>
-        <w:t>Em resumo: o Processador gera os dados; o Painel mostra e trata. Quem só acompanha precisa apenas do Painel.</w:t>
+        <w:t>Em resumo: o Processador gera os dados; o Visualizador mostra e trata. Quem só acompanha precisa apenas do Visualizador.</w:t>
       </w:r>
     </w:p>
     <w:p>
@@ -1033,7 +1033,7 @@
         <w:rPr>
           <w:sz w:val="21"/>
         </w:rPr>
-        <w:t>cada pessoa abre o Painel no seu próprio computador e enxerga o mesmo cenário.</w:t>
+        <w:t>cada pessoa abre o Visualizador no seu próprio computador e enxerga o mesmo cenário.</w:t>
       </w:r>
     </w:p>
     <w:p>
@@ -1256,7 +1256,7 @@
           <w:color w:val="1F2D5C"/>
           <w:sz w:val="18"/>
         </w:rPr>
-        <w:t>├── EXECUTAVEIS  ← os programas (Processador e Painel)</w:t>
+        <w:t>├── EXECUTAVEIS  ← os programas (Processador e Visualizador)</w:t>
       </w:r>
       <w:r>
         <w:br/>
@@ -1679,7 +1679,7 @@
         <w:rPr>
           <w:sz w:val="21"/>
         </w:rPr>
-        <w:t>Copiar a pasta de programas para uma pasta no seu próprio computador e usar a partir dela. Isso vale tanto para quem vai processar quanto para quem só vai acompanhar o Painel.</w:t>
+        <w:t>Copiar a pasta de programas para uma pasta no seu próprio computador e usar a partir dela. Isso vale tanto para quem vai processar quanto para quem só vai acompanhar pelo Visualizador.</w:t>
       </w:r>
     </w:p>
     <w:p>
@@ -1721,13 +1721,13 @@
           <w:color w:val="1F2D5C"/>
           <w:sz w:val="21"/>
         </w:rPr>
-        <w:t xml:space="preserve">Passo 5 — Abrir o Painel (cada pessoa). </w:t>
+        <w:t xml:space="preserve">Passo 5 — Abrir o Visualizador (cada pessoa). </w:t>
       </w:r>
       <w:r>
         <w:rPr>
           <w:sz w:val="21"/>
         </w:rPr>
-        <w:t>Abrir o Painel a partir da sua cópia. Ele abre sozinho no navegador, já com os resultados. A partir daí, é só acompanhar e tratar as pendências pelas telas (item 6).</w:t>
+        <w:t>Abrir o Visualizador a partir da sua cópia. Ele abre o painel sozinho no navegador, já com os resultados. A partir daí, é só acompanhar e tratar as pendências pelas telas (item 6).</w:t>
       </w:r>
     </w:p>
     <w:p>

</xml_diff>

<commit_message>
docs: passo a passo no fluxo real (sistema ja na pasta compartilhada)
Remove 'preparar o compartilhado' como passo (instalacao unica da TI, vira
premissa). Fluxo do usuario comeca em copiar EXECUTAVEIS para o PC local e rodar
de la: copiar -> colocar arquivos -> processar -> abrir Visualizador -> atualizar.

Co-Authored-By: Claude Opus 4.8 <noreply@anthropic.com>
</commit_message>
<xml_diff>
--- a/ENTREGA/CVC_IAM_Analytics_Entrega_SYSTUR_v1.0.docx
+++ b/ENTREGA/CVC_IAM_Analytics_Entrega_SYSTUR_v1.0.docx
@@ -1647,7 +1647,7 @@
           <w:color w:val="1F2D5C"/>
           <w:sz w:val="21"/>
         </w:rPr>
-        <w:t>Importante: os programas funcionam no computador de cada pessoa, e não "na rede". O lugar compartilhado serve apenas para guardar os dados, que todos enxergam.</w:t>
+        <w:t>Importante: a solução já estará instalada na pasta compartilhada da empresa (instalação única, feita pela TI). Os programas, porém, NÃO rodam de lá — cada pessoa copia a pasta EXECUTAVEIS para o seu próprio computador e roda a partir dela. A pasta compartilhada guarda apenas os dados, que todos enxergam.</w:t>
       </w:r>
     </w:p>
     <w:p>
@@ -1657,13 +1657,13 @@
           <w:color w:val="1F2D5C"/>
           <w:sz w:val="21"/>
         </w:rPr>
-        <w:t xml:space="preserve">Passo 1 — Preparar o espaço compartilhado (uma vez). </w:t>
+        <w:t xml:space="preserve">Passo 1 — Copiar os programas para o seu computador (cada pessoa). </w:t>
       </w:r>
       <w:r>
         <w:rPr>
           <w:sz w:val="21"/>
         </w:rPr>
-        <w:t>Copiar a pasta da solução para o lugar compartilhado da empresa (a área de pastas que o time acessa). A base começa vazia.</w:t>
+        <w:t>Na pasta compartilhada, copie a pasta EXECUTAVEIS para uma pasta no seu computador (por exemplo, em C:\CVC) e use a partir dela. Vale tanto para quem vai processar quanto para quem só vai acompanhar.</w:t>
       </w:r>
     </w:p>
     <w:p>
@@ -1673,13 +1673,13 @@
           <w:color w:val="1F2D5C"/>
           <w:sz w:val="21"/>
         </w:rPr>
-        <w:t xml:space="preserve">Passo 2 — Levar os programas para o seu computador (cada pessoa). </w:t>
+        <w:t xml:space="preserve">Passo 2 — Colocar os arquivos (pessoa responsável). </w:t>
       </w:r>
       <w:r>
         <w:rPr>
           <w:sz w:val="21"/>
         </w:rPr>
-        <w:t>Copiar a pasta de programas para uma pasta no seu próprio computador e usar a partir dela. Isso vale tanto para quem vai processar quanto para quem só vai acompanhar pelo Visualizador.</w:t>
+        <w:t>Guardar os quatro arquivos nas pastas da ENTRADA, na pasta compartilhada, conforme o item 5.2.</w:t>
       </w:r>
     </w:p>
     <w:p>
@@ -1689,13 +1689,13 @@
           <w:color w:val="1F2D5C"/>
           <w:sz w:val="21"/>
         </w:rPr>
-        <w:t xml:space="preserve">Passo 3 — Colocar os arquivos. </w:t>
+        <w:t xml:space="preserve">Passo 3 — Processar (pessoa responsável). </w:t>
       </w:r>
       <w:r>
         <w:rPr>
           <w:sz w:val="21"/>
         </w:rPr>
-        <w:t>Guardar os quatro arquivos nas pastas indicadas no item 5.2.</w:t>
+        <w:t>Abrir o Processador a partir da sua cópia. Ele compara tudo e grava os resultados na base compartilhada; arquiva os arquivos usados e separa os que tiverem problema para conferência.</w:t>
       </w:r>
     </w:p>
     <w:p>
@@ -1705,13 +1705,13 @@
           <w:color w:val="1F2D5C"/>
           <w:sz w:val="21"/>
         </w:rPr>
-        <w:t xml:space="preserve">Passo 4 — Processar (pessoa responsável). </w:t>
+        <w:t xml:space="preserve">Passo 4 — Abrir o Visualizador (cada pessoa). </w:t>
       </w:r>
       <w:r>
         <w:rPr>
           <w:sz w:val="21"/>
         </w:rPr>
-        <w:t>Abrir o Processador a partir da sua cópia. Ele compara tudo e prepara os resultados. Os arquivos usados são arquivados automaticamente; se algum arquivo tiver problema, ele é separado para conferência.</w:t>
+        <w:t>Abrir o Visualizador a partir da sua cópia. Ele abre o painel no navegador, já com os resultados. A partir daí, é só acompanhar e tratar as pendências pelas telas (item 6).</w:t>
       </w:r>
     </w:p>
     <w:p>
@@ -1721,29 +1721,13 @@
           <w:color w:val="1F2D5C"/>
           <w:sz w:val="21"/>
         </w:rPr>
-        <w:t xml:space="preserve">Passo 5 — Abrir o Visualizador (cada pessoa). </w:t>
+        <w:t xml:space="preserve">Passo 5 — Atualizar o cenário. </w:t>
       </w:r>
       <w:r>
         <w:rPr>
           <w:sz w:val="21"/>
         </w:rPr>
-        <w:t>Abrir o Visualizador a partir da sua cópia. Ele abre o painel sozinho no navegador, já com os resultados. A partir daí, é só acompanhar e tratar as pendências pelas telas (item 6).</w:t>
-      </w:r>
-    </w:p>
-    <w:p>
-      <w:r>
-        <w:rPr>
-          <w:b/>
-          <w:color w:val="1F2D5C"/>
-          <w:sz w:val="21"/>
-        </w:rPr>
-        <w:t xml:space="preserve">Passo 6 — Atualizar o cenário. </w:t>
-      </w:r>
-      <w:r>
-        <w:rPr>
-          <w:sz w:val="21"/>
-        </w:rPr>
-        <w:t>Sempre que chegarem bases novas, repetir os passos 3 e 4 (colocar os arquivos e processar). Mexer apenas no Painel não exige processar de novo.</w:t>
+        <w:t>Sempre que chegarem bases novas, repetir os passos 2 e 3 (colocar os arquivos e processar). Mexer apenas no painel não exige processar de novo.</w:t>
       </w:r>
     </w:p>
     <w:p>

</xml_diff>

<commit_message>
docs: quebra de pagina antes de cada print + detalha funcoes de cada aba
Cada tela em sua pagina (titulo+explicacao+print juntos). Cada aba detalhada:
o que mostra + o que da pra fazer (filtros por coluna/periodo, busca, ordenacao,
agrupar +/-, resolver sob chamado, quarentena, salvar filtros, exportar Excel).

Co-Authored-By: Claude Opus 4.8 <noreply@anthropic.com>
</commit_message>
<xml_diff>
--- a/ENTREGA/CVC_IAM_Analytics_Entrega_SYSTUR_v1.0.docx
+++ b/ENTREGA/CVC_IAM_Analytics_Entrega_SYSTUR_v1.0.docx
@@ -1812,7 +1812,22 @@
           <w:i w:val="0"/>
           <w:sz w:val="21"/>
         </w:rPr>
-        <w:t>O Painel tem seis telas. Abaixo, o que cada uma mostra e como usar. As imagens são ilustrativas, com dados reais do ambiente.</w:t>
+        <w:t>O Painel tem seis telas. Abaixo, o que cada uma mostra, o que dá para fazer e como usar. As imagens são ilustrativas, com dados reais do ambiente.</w:t>
+      </w:r>
+    </w:p>
+    <w:p>
+      <w:r>
+        <w:rPr>
+          <w:i/>
+          <w:color w:val="5A6377"/>
+          <w:sz w:val="21"/>
+        </w:rPr>
+        <w:t>Em todas as listas você pode: buscar por texto, filtrar por qualquer coluna (clicando no título da coluna), ordenar, escolher quantos itens ver por página e exportar para Excel — e a exportação sai igual ao que está na tela, respeitando os filtros aplicados.</w:t>
+      </w:r>
+    </w:p>
+    <w:p>
+      <w:r>
+        <w:br w:type="page"/>
       </w:r>
     </w:p>
     <w:p>
@@ -1833,7 +1848,72 @@
           <w:i w:val="0"/>
           <w:sz w:val="21"/>
         </w:rPr>
-        <w:t>Resumo do dia a dia: quantas pessoas há em cada classificação, a evolução dos atendimentos (identificados, resolvidos e regularizados) e o tempo de tratamento. Use para enxergar o todo e priorizar o trabalho.</w:t>
+        <w:t>É o resumo gerencial do dia a dia. Não tem ações — é uma tela de leitura para enxergar o todo e priorizar.</w:t>
+      </w:r>
+    </w:p>
+    <w:p>
+      <w:r>
+        <w:rPr>
+          <w:b/>
+          <w:color w:val="1F2D5C"/>
+          <w:sz w:val="21"/>
+        </w:rPr>
+        <w:t>Mostra:</w:t>
+      </w:r>
+    </w:p>
+    <w:p>
+      <w:pPr>
+        <w:pStyle w:val="ListBullet"/>
+      </w:pPr>
+      <w:r>
+        <w:rPr>
+          <w:sz w:val="21"/>
+        </w:rPr>
+        <w:t>quantas pessoas há em cada classificação (Incluir, Alterar, Em Análise, Não Mapeado, Aderente);</w:t>
+      </w:r>
+    </w:p>
+    <w:p>
+      <w:pPr>
+        <w:pStyle w:val="ListBullet"/>
+      </w:pPr>
+      <w:r>
+        <w:rPr>
+          <w:sz w:val="21"/>
+        </w:rPr>
+        <w:t>a evolução dos atendimentos nos últimos 30 dias: identificados, resolvidos e regularizados;</w:t>
+      </w:r>
+    </w:p>
+    <w:p>
+      <w:pPr>
+        <w:pStyle w:val="ListBullet"/>
+      </w:pPr>
+      <w:r>
+        <w:rPr>
+          <w:sz w:val="21"/>
+        </w:rPr>
+        <w:t>o tempo de tratamento do ciclo (Pendência → Resolvido → Aderente);</w:t>
+      </w:r>
+    </w:p>
+    <w:p>
+      <w:pPr>
+        <w:pStyle w:val="ListBullet"/>
+      </w:pPr>
+      <w:r>
+        <w:rPr>
+          <w:sz w:val="21"/>
+        </w:rPr>
+        <w:t>a distribuição das pendências por tipo e por sistema;</w:t>
+      </w:r>
+    </w:p>
+    <w:p>
+      <w:pPr>
+        <w:pStyle w:val="ListBullet"/>
+      </w:pPr>
+      <w:r>
+        <w:rPr>
+          <w:sz w:val="21"/>
+        </w:rPr>
+        <w:t>o tempo que as pendências estão abertas (aging) e a movimentação de RH.</w:t>
       </w:r>
     </w:p>
     <w:p>
@@ -1877,6 +1957,11 @@
       </w:r>
     </w:p>
     <w:p>
+      <w:r>
+        <w:br w:type="page"/>
+      </w:r>
+    </w:p>
+    <w:p>
       <w:pPr>
         <w:pStyle w:val="Heading2"/>
       </w:pPr>
@@ -1894,7 +1979,61 @@
           <w:i w:val="0"/>
           <w:sz w:val="21"/>
         </w:rPr>
-        <w:t>Busca por pessoa — por nome, matrícula, login ou CPF. Use para ver a situação completa de acessos e pendências de alguém específico, com atalhos para as outras telas.</w:t>
+        <w:t>Para investigar uma pessoa específica e ver a situação completa dela.</w:t>
+      </w:r>
+    </w:p>
+    <w:p>
+      <w:r>
+        <w:rPr>
+          <w:b/>
+          <w:color w:val="1F2D5C"/>
+          <w:sz w:val="21"/>
+        </w:rPr>
+        <w:t>Você pode:</w:t>
+      </w:r>
+    </w:p>
+    <w:p>
+      <w:pPr>
+        <w:pStyle w:val="ListBullet"/>
+      </w:pPr>
+      <w:r>
+        <w:rPr>
+          <w:sz w:val="21"/>
+        </w:rPr>
+        <w:t>buscar por nome, matrícula, login, CPF ou e-mail;</w:t>
+      </w:r>
+    </w:p>
+    <w:p>
+      <w:pPr>
+        <w:pStyle w:val="ListBullet"/>
+      </w:pPr>
+      <w:r>
+        <w:rPr>
+          <w:sz w:val="21"/>
+        </w:rPr>
+        <w:t>expandir a pessoa para ver todos os acessos e pendências dela;</w:t>
+      </w:r>
+    </w:p>
+    <w:p>
+      <w:pPr>
+        <w:pStyle w:val="ListBullet"/>
+      </w:pPr>
+      <w:r>
+        <w:rPr>
+          <w:sz w:val="21"/>
+        </w:rPr>
+        <w:t>abrir um painel lateral com os detalhes;</w:t>
+      </w:r>
+    </w:p>
+    <w:p>
+      <w:pPr>
+        <w:pStyle w:val="ListBullet"/>
+      </w:pPr>
+      <w:r>
+        <w:rPr>
+          <w:sz w:val="21"/>
+        </w:rPr>
+        <w:t>saltar direto para as telas de Pendências, Histórico ou Aderentes daquela pessoa, pelos atalhos.</w:t>
       </w:r>
     </w:p>
     <w:p>
@@ -1938,6 +2077,11 @@
       </w:r>
     </w:p>
     <w:p>
+      <w:r>
+        <w:br w:type="page"/>
+      </w:r>
+    </w:p>
+    <w:p>
       <w:pPr>
         <w:pStyle w:val="Heading2"/>
       </w:pPr>
@@ -1955,7 +2099,72 @@
           <w:i w:val="0"/>
           <w:sz w:val="21"/>
         </w:rPr>
-        <w:t>A lista de trabalho: por pessoa, o que precisa ser incluído, alterado ou analisado. Use para tratar caso a caso; permite filtrar, agrupar e exportar para Excel.</w:t>
+        <w:t>É a lista de trabalho — por pessoa, o que precisa ser incluído, alterado ou analisado. É aqui que o tratamento acontece.</w:t>
+      </w:r>
+    </w:p>
+    <w:p>
+      <w:r>
+        <w:rPr>
+          <w:b/>
+          <w:color w:val="1F2D5C"/>
+          <w:sz w:val="21"/>
+        </w:rPr>
+        <w:t>Você pode:</w:t>
+      </w:r>
+    </w:p>
+    <w:p>
+      <w:pPr>
+        <w:pStyle w:val="ListBullet"/>
+      </w:pPr>
+      <w:r>
+        <w:rPr>
+          <w:sz w:val="21"/>
+        </w:rPr>
+        <w:t>filtrar por qualquer coluna (vínculo, departamento, status, tipo…) e por período;</w:t>
+      </w:r>
+    </w:p>
+    <w:p>
+      <w:pPr>
+        <w:pStyle w:val="ListBullet"/>
+      </w:pPr>
+      <w:r>
+        <w:rPr>
+          <w:sz w:val="21"/>
+        </w:rPr>
+        <w:t>agrupar por pessoa e expandir/recolher os acessos (botão +/−);</w:t>
+      </w:r>
+    </w:p>
+    <w:p>
+      <w:pPr>
+        <w:pStyle w:val="ListBullet"/>
+      </w:pPr>
+      <w:r>
+        <w:rPr>
+          <w:sz w:val="21"/>
+        </w:rPr>
+        <w:t>resolver uma pendência, informando o chamado e uma descrição;</w:t>
+      </w:r>
+    </w:p>
+    <w:p>
+      <w:pPr>
+        <w:pStyle w:val="ListBullet"/>
+      </w:pPr>
+      <w:r>
+        <w:rPr>
+          <w:sz w:val="21"/>
+        </w:rPr>
+        <w:t>enviar um acesso para quarentena (observação por prazo);</w:t>
+      </w:r>
+    </w:p>
+    <w:p>
+      <w:pPr>
+        <w:pStyle w:val="ListBullet"/>
+      </w:pPr>
+      <w:r>
+        <w:rPr>
+          <w:sz w:val="21"/>
+        </w:rPr>
+        <w:t>salvar filtros favoritos para reusar; exportar para Excel igual à tela.</w:t>
       </w:r>
     </w:p>
     <w:p>
@@ -1999,6 +2208,11 @@
       </w:r>
     </w:p>
     <w:p>
+      <w:r>
+        <w:br w:type="page"/>
+      </w:r>
+    </w:p>
+    <w:p>
       <w:pPr>
         <w:pStyle w:val="Heading2"/>
       </w:pPr>
@@ -2016,7 +2230,50 @@
           <w:i w:val="0"/>
           <w:sz w:val="21"/>
         </w:rPr>
-        <w:t>As pessoas que já estão com os acessos corretos, com o histórico de datas e o tempo que levou para regularizar. Use para conferir o que já foi resolvido.</w:t>
+        <w:t>As pessoas que já estão com os acessos corretos (conformes). Use para conferir o que já foi resolvido.</w:t>
+      </w:r>
+    </w:p>
+    <w:p>
+      <w:r>
+        <w:rPr>
+          <w:b/>
+          <w:color w:val="1F2D5C"/>
+          <w:sz w:val="21"/>
+        </w:rPr>
+        <w:t>Mostra / você pode:</w:t>
+      </w:r>
+    </w:p>
+    <w:p>
+      <w:pPr>
+        <w:pStyle w:val="ListBullet"/>
+      </w:pPr>
+      <w:r>
+        <w:rPr>
+          <w:sz w:val="21"/>
+        </w:rPr>
+        <w:t>a trilha de datas do ciclo (quando virou pendência, quando foi resolvido, quando ficou aderente) e o tempo total até regularizar;</w:t>
+      </w:r>
+    </w:p>
+    <w:p>
+      <w:pPr>
+        <w:pStyle w:val="ListBullet"/>
+      </w:pPr>
+      <w:r>
+        <w:rPr>
+          <w:sz w:val="21"/>
+        </w:rPr>
+        <w:t>buscar e filtrar por coluna (cargo, sistema, perfil…);</w:t>
+      </w:r>
+    </w:p>
+    <w:p>
+      <w:pPr>
+        <w:pStyle w:val="ListBullet"/>
+      </w:pPr>
+      <w:r>
+        <w:rPr>
+          <w:sz w:val="21"/>
+        </w:rPr>
+        <w:t>exportar a lista para Excel.</w:t>
       </w:r>
     </w:p>
     <w:p>
@@ -2060,6 +2317,11 @@
       </w:r>
     </w:p>
     <w:p>
+      <w:r>
+        <w:br w:type="page"/>
+      </w:r>
+    </w:p>
+    <w:p>
       <w:pPr>
         <w:pStyle w:val="Heading2"/>
       </w:pPr>
@@ -2077,7 +2339,50 @@
           <w:i w:val="0"/>
           <w:sz w:val="21"/>
         </w:rPr>
-        <w:t>A trilha do que aconteceu — admissões, mudanças de cargo/área e a evolução de cada acesso ao longo do tempo. Use como evidência para auditoria.</w:t>
+        <w:t>A trilha do que aconteceu ao longo do tempo. Serve como evidência para auditoria.</w:t>
+      </w:r>
+    </w:p>
+    <w:p>
+      <w:r>
+        <w:rPr>
+          <w:b/>
+          <w:color w:val="1F2D5C"/>
+          <w:sz w:val="21"/>
+        </w:rPr>
+        <w:t>Mostra / você pode:</w:t>
+      </w:r>
+    </w:p>
+    <w:p>
+      <w:pPr>
+        <w:pStyle w:val="ListBullet"/>
+      </w:pPr>
+      <w:r>
+        <w:rPr>
+          <w:sz w:val="21"/>
+        </w:rPr>
+        <w:t>admissões, mudanças de cargo/área e a evolução de cada acesso (pendência → resolvido → aderente);</w:t>
+      </w:r>
+    </w:p>
+    <w:p>
+      <w:pPr>
+        <w:pStyle w:val="ListBullet"/>
+      </w:pPr>
+      <w:r>
+        <w:rPr>
+          <w:sz w:val="21"/>
+        </w:rPr>
+        <w:t>filtrar por período e buscar por matrícula ou nome;</w:t>
+      </w:r>
+    </w:p>
+    <w:p>
+      <w:pPr>
+        <w:pStyle w:val="ListBullet"/>
+      </w:pPr>
+      <w:r>
+        <w:rPr>
+          <w:sz w:val="21"/>
+        </w:rPr>
+        <w:t>expandir cada pessoa para ver a sequência completa; exportar para Excel.</w:t>
       </w:r>
     </w:p>
     <w:p>
@@ -2121,6 +2426,11 @@
       </w:r>
     </w:p>
     <w:p>
+      <w:r>
+        <w:br w:type="page"/>
+      </w:r>
+    </w:p>
+    <w:p>
       <w:pPr>
         <w:pStyle w:val="Heading2"/>
       </w:pPr>
@@ -2139,6 +2449,49 @@
           <w:sz w:val="21"/>
         </w:rPr>
         <w:t>Acessos colocados em observação por um prazo, antes de uma decisão definitiva. Use quando precisar de um tempo para avaliar antes de agir.</w:t>
+      </w:r>
+    </w:p>
+    <w:p>
+      <w:r>
+        <w:rPr>
+          <w:b/>
+          <w:color w:val="1F2D5C"/>
+          <w:sz w:val="21"/>
+        </w:rPr>
+        <w:t>Você pode:</w:t>
+      </w:r>
+    </w:p>
+    <w:p>
+      <w:pPr>
+        <w:pStyle w:val="ListBullet"/>
+      </w:pPr>
+      <w:r>
+        <w:rPr>
+          <w:sz w:val="21"/>
+        </w:rPr>
+        <w:t>ver as quarentenas ativas, com os dias restantes de cada uma;</w:t>
+      </w:r>
+    </w:p>
+    <w:p>
+      <w:pPr>
+        <w:pStyle w:val="ListBullet"/>
+      </w:pPr>
+      <w:r>
+        <w:rPr>
+          <w:sz w:val="21"/>
+        </w:rPr>
+        <w:t>consultar o histórico de quarentenas já encerradas;</w:t>
+      </w:r>
+    </w:p>
+    <w:p>
+      <w:pPr>
+        <w:pStyle w:val="ListBullet"/>
+      </w:pPr>
+      <w:r>
+        <w:rPr>
+          <w:sz w:val="21"/>
+        </w:rPr>
+        <w:t>filtrar e exportar para Excel.</w:t>
       </w:r>
     </w:p>
     <w:p>

</xml_diff>